<commit_message>
synth: BUILD v5 detail pass — Block 18 + 14 thermal + Phase 2 + PCB v5
- Block 18 (Gate/Crush): full topology с R-values, threshold/hysteresis,
  LF398 S&H clocking, R-2R stuck-at-0 LSB bitcrush, ATtiny85 firmware map,
  BOM $7.95.
- Block 14: thermal budget для DAMP/TOLL/STALL modes. STALL continuous
  hold = 1.45W → 217°C ΔT (fault) → mandatory PWM throttle к 40% duty
  (firmware) для thermal safety. Q5 2N7000 comfortable. SPEC warns
  "STALL max 5s continuous".
- Phase 2 cold palette (Blocks 21-25): detailed schematics PULSE LFO,
  FOG random S&H, FROST SVF VCF, CHILL expander, HUM Twin-T 50/60Hz.
  Daughter board IC allocation U9-U12. Total Phase 2 BOM $37.95.
- PCB v5 review: extended zones 10-14 для Phaser/Gate-Crush/COLOR
  slider/Shape Form satellite/Phase 2 header. Critical separation
  table, revised placement priority, recommended 4-layer для premium.
- Regenerated .docx via pandoc (BUILD 76K→95K).

https://claude.ai/code/session_01FynJ6yHJNSER8S9bNKNbcc
</commit_message>
<xml_diff>
--- a/synth/LAST_NIGHT_SPEC.docx
+++ b/synth/LAST_NIGHT_SPEC.docx
@@ -7327,6 +7327,43 @@
       </w:r>
       <w:r>
         <w:t xml:space="preserve">electrical implementation идентична Decision 08 — solenoid double-function через 555 monostable + OR-gate diodes. Изменена только entry-point (CV jacks вместо footswitches).</w:t>
+      </w:r>
+    </w:p>
+    <w:p>
+      <w:pPr>
+        <w:pStyle w:val="BlockText"/>
+      </w:pPr>
+      <w:r>
+        <w:t xml:space="preserve">⚠</w:t>
+      </w:r>
+      <w:r>
+        <w:t xml:space="preserve"> </w:t>
+      </w:r>
+      <w:r>
+        <w:rPr>
+          <w:bCs/>
+          <w:b/>
+        </w:rPr>
+        <w:t xml:space="preserve">STALL safety</w:t>
+      </w:r>
+      <w:r>
+        <w:t xml:space="preserve">: STALL CV — momentary gesture,</w:t>
+      </w:r>
+      <w:r>
+        <w:t xml:space="preserve"> </w:t>
+      </w:r>
+      <w:r>
+        <w:rPr>
+          <w:bCs/>
+          <w:b/>
+        </w:rPr>
+        <w:t xml:space="preserve">max 5 секунд continuous high</w:t>
+      </w:r>
+      <w:r>
+        <w:t xml:space="preserve"> </w:t>
+      </w:r>
+      <w:r>
+        <w:t xml:space="preserve">при default setup. Beyond that — firmware PWM throttle automatically dims coil drive к 40% duty (sufficient hold force) для thermal protection. См. BUILD §Block 14 thermal budget.</w:t>
       </w:r>
     </w:p>
     <w:bookmarkEnd w:id="39"/>

</xml_diff>